<commit_message>
Updated PPO Policy with larger architecture
</commit_message>
<xml_diff>
--- a/Project Proposal.docx
+++ b/Project Proposal.docx
@@ -352,19 +352,7 @@
         <w:rPr>
           <w:rFonts w:ascii="Garamond" w:hAnsi="Garamond"/>
         </w:rPr>
-        <w:t xml:space="preserve">1. </w:t>
-      </w:r>
-      <w:r>
-        <w:rPr>
-          <w:rFonts w:ascii="Garamond" w:hAnsi="Garamond"/>
-        </w:rPr>
-        <w:t xml:space="preserve">Literature Review &amp; </w:t>
-      </w:r>
-      <w:r>
-        <w:rPr>
-          <w:rFonts w:ascii="Garamond" w:hAnsi="Garamond"/>
-        </w:rPr>
-        <w:t>Scoping Process</w:t>
+        <w:t>1. Literature Review &amp; Scoping Process</w:t>
       </w:r>
     </w:p>
     <w:p>
@@ -413,13 +401,7 @@
         <w:rPr>
           <w:rFonts w:ascii="Garamond" w:hAnsi="Garamond"/>
         </w:rPr>
-        <w:t>Refine</w:t>
-      </w:r>
-      <w:r>
-        <w:rPr>
-          <w:rFonts w:ascii="Garamond" w:hAnsi="Garamond"/>
-        </w:rPr>
-        <w:t xml:space="preserve"> and decide on research questions</w:t>
+        <w:t>Refine and decide on research questions</w:t>
       </w:r>
     </w:p>
     <w:p>
@@ -437,19 +419,7 @@
         <w:rPr>
           <w:rFonts w:ascii="Garamond" w:hAnsi="Garamond"/>
         </w:rPr>
-        <w:t>Outline</w:t>
-      </w:r>
-      <w:r>
-        <w:rPr>
-          <w:rFonts w:ascii="Garamond" w:hAnsi="Garamond"/>
-        </w:rPr>
-        <w:t xml:space="preserve"> environment choice</w:t>
-      </w:r>
-      <w:r>
-        <w:rPr>
-          <w:rFonts w:ascii="Garamond" w:hAnsi="Garamond"/>
-        </w:rPr>
-        <w:t>/testing criterion</w:t>
+        <w:t>Outline environment choice/testing criterion</w:t>
       </w:r>
     </w:p>
     <w:p>
@@ -667,12 +637,70 @@
           <w:rFonts w:ascii="Garamond" w:hAnsi="Garamond"/>
         </w:rPr>
       </w:pPr>
-      <w:r>
-        <w:rPr>
-          <w:rFonts w:ascii="Garamond" w:hAnsi="Garamond"/>
-        </w:rPr>
-        <w:t>In order to compare sample efficiency, planning time, generalization.</w:t>
-      </w:r>
+      <w:proofErr w:type="gramStart"/>
+      <w:r>
+        <w:rPr>
+          <w:rFonts w:ascii="Garamond" w:hAnsi="Garamond"/>
+        </w:rPr>
+        <w:t>In order to</w:t>
+      </w:r>
+      <w:proofErr w:type="gramEnd"/>
+      <w:r>
+        <w:rPr>
+          <w:rFonts w:ascii="Garamond" w:hAnsi="Garamond"/>
+        </w:rPr>
+        <w:t xml:space="preserve"> compare sample efficiency, planning time, generalization.</w:t>
+      </w:r>
+    </w:p>
+    <w:p>
+      <w:pPr>
+        <w:rPr>
+          <w:rFonts w:ascii="Garamond" w:hAnsi="Garamond"/>
+        </w:rPr>
+      </w:pPr>
+    </w:p>
+    <w:p>
+      <w:pPr>
+        <w:shd w:val="clear" w:color="auto" w:fill="FFF3CD"/>
+        <w:spacing w:after="100"/>
+        <w:ind w:left="360"/>
+      </w:pPr>
+      <w:r>
+        <w:rPr>
+          <w:rFonts w:ascii="Times New Roman" w:eastAsia="Times New Roman" w:hAnsi="Times New Roman" w:cs="Times New Roman"/>
+          <w:i/>
+          <w:iCs/>
+          <w:color w:val="856404"/>
+          <w:sz w:val="20"/>
+          <w:szCs w:val="20"/>
+        </w:rPr>
+        <w:t>[SCAFFOLD: Discuss Decision Transformer (Chen et al., 2021), Gato (Reed et al., 2022), Trajectory Transformer (Janner et al., 2021), STORM (Zhang et al., 2023). Cover: Transformers as policy networks vs as world models vs as encoders. Gap: existing uses of Transformers in RL treat the observation token vocabulary as a technical detail; no work investigates whether Transformer-derived tokens are semantically structured.]</w:t>
+      </w:r>
+    </w:p>
+    <w:p>
+      <w:pPr>
+        <w:shd w:val="clear" w:color="auto" w:fill="FFF3CD"/>
+        <w:spacing w:after="100"/>
+        <w:ind w:left="360"/>
+      </w:pPr>
+      <w:r>
+        <w:rPr>
+          <w:rFonts w:ascii="Times New Roman" w:eastAsia="Times New Roman" w:hAnsi="Times New Roman" w:cs="Times New Roman"/>
+          <w:i/>
+          <w:iCs/>
+          <w:color w:val="856404"/>
+          <w:sz w:val="20"/>
+          <w:szCs w:val="20"/>
+        </w:rPr>
+        <w:t>[SCAFFOLD: Discuss probing classifiers (Alain &amp; Bengio, 2017), Network Dissection (Bau et al., 2017), beta-VAE disentanglement (Higgins et al., 2017), Concept Bottleneck Models (Koh et al., 2020). Cover: what probing tests, linear vs nonlinear probes, disentanglement. Gap: these methods are applied almost exclusively to supervised vision models or continuous generative models, not discrete RL representations.]</w:t>
+      </w:r>
+    </w:p>
+    <w:p>
+      <w:pPr>
+        <w:rPr>
+          <w:rFonts w:ascii="Garamond" w:hAnsi="Garamond"/>
+        </w:rPr>
+      </w:pPr>
     </w:p>
     <w:sectPr>
       <w:pgSz w:w="12240" w:h="15840"/>

</xml_diff>